<commit_message>
Update AZ-500 courseware to v5
</commit_message>
<xml_diff>
--- a/courseware/LG-Microsoft Azure Security Engineer Associate (AZ-500).docx
+++ b/courseware/LG-Microsoft Azure Security Engineer Associate (AZ-500).docx
@@ -4,12 +4,59 @@
   <w:body>
     <w:p>
       <w:pPr>
+        <w:spacing w:after="1440"/>
+      </w:pPr>
+    </w:p>
+    <w:p>
+      <w:pPr>
+        <w:spacing w:after="160"/>
+        <w:jc w:val="center"/>
+      </w:pPr>
+      <w:r>
+        <w:drawing>
+          <wp:inline xmlns:a="http://schemas.openxmlformats.org/drawingml/2006/main" xmlns:pic="http://schemas.openxmlformats.org/drawingml/2006/picture">
+            <wp:extent cx="1417320" cy="1417320"/>
+            <wp:docPr id="1" name="Picture 1"/>
+            <wp:cNvGraphicFramePr>
+              <a:graphicFrameLocks noChangeAspect="1"/>
+            </wp:cNvGraphicFramePr>
+            <a:graphic>
+              <a:graphicData uri="http://schemas.openxmlformats.org/drawingml/2006/picture">
+                <pic:pic>
+                  <pic:nvPicPr>
+                    <pic:cNvPr id="0" name="image.png"/>
+                    <pic:cNvPicPr/>
+                  </pic:nvPicPr>
+                  <pic:blipFill>
+                    <a:blip r:embed="rId9"/>
+                    <a:stretch>
+                      <a:fillRect/>
+                    </a:stretch>
+                  </pic:blipFill>
+                  <pic:spPr>
+                    <a:xfrm>
+                      <a:off x="0" y="0"/>
+                      <a:ext cx="1417320" cy="1417320"/>
+                    </a:xfrm>
+                    <a:prstGeom prst="rect"/>
+                  </pic:spPr>
+                </pic:pic>
+              </a:graphicData>
+            </a:graphic>
+          </wp:inline>
+        </w:drawing>
+      </w:r>
+    </w:p>
+    <w:p>
+      <w:pPr>
+        <w:spacing w:after="0"/>
         <w:jc w:val="center"/>
       </w:pPr>
       <w:r>
         <w:rPr>
           <w:rFonts w:ascii="Arial" w:hAnsi="Arial"/>
           <w:b/>
+          <w:color w:val="111827"/>
           <w:sz w:val="22"/>
         </w:rPr>
         <w:t>Tertiary Infotech Academy Pte Ltd</w:t>
@@ -17,6 +64,7 @@
     </w:p>
     <w:p>
       <w:pPr>
+        <w:spacing w:after="360"/>
         <w:jc w:val="center"/>
       </w:pPr>
       <w:r>
@@ -30,33 +78,21 @@
     </w:p>
     <w:p>
       <w:pPr>
+        <w:spacing w:after="240"/>
         <w:jc w:val="center"/>
-        <w:shd w:fill="1F6FEB"/>
-      </w:pPr>
-      <w:r>
-        <w:rPr>
-          <w:sz w:val="6"/>
-        </w:rPr>
-        <w:t xml:space="preserve"> </w:t>
-      </w:r>
-    </w:p>
-    <w:p/>
-    <w:p>
-      <w:pPr>
-        <w:jc w:val="center"/>
-        <w:shd w:fill="F3F7FB"/>
       </w:pPr>
       <w:r>
         <w:rPr>
           <w:b/>
-          <w:color w:val="111827"/>
-          <w:sz w:val="40"/>
+          <w:color w:val="1F6FEB"/>
+          <w:sz w:val="42"/>
         </w:rPr>
         <w:t>LEARNER GUIDE</w:t>
       </w:r>
     </w:p>
     <w:p>
       <w:pPr>
+        <w:spacing w:after="200"/>
         <w:jc w:val="center"/>
       </w:pPr>
       <w:r>
@@ -67,7 +103,6 @@
         <w:t>For</w:t>
       </w:r>
     </w:p>
-    <w:p/>
     <w:p>
       <w:pPr>
         <w:spacing w:before="160" w:after="160"/>
@@ -149,7 +184,7 @@
           <w:color w:val="4B5563"/>
           <w:sz w:val="20"/>
         </w:rPr>
-        <w:t>Version 4</w:t>
+        <w:t>Version 5</w:t>
       </w:r>
     </w:p>
     <w:p>
@@ -259,7 +294,7 @@
           </w:tcPr>
           <w:p>
             <w:r>
-              <w:t>8 July 2026</w:t>
+              <w:t>9 July 2026</w:t>
             </w:r>
           </w:p>
         </w:tc>
@@ -269,7 +304,49 @@
           </w:tcPr>
           <w:p>
             <w:r>
-              <w:t>Aligned assessment flow to WA then PP and regenerated courseware/lab-aligned materials.</w:t>
+              <w:t>Added WSQ cover pages, improved Learner Guide visuals and included the AZ-500 practice exam slide.</w:t>
+            </w:r>
+          </w:p>
+        </w:tc>
+        <w:tc>
+          <w:tcPr>
+            <w:tcW w:type="dxa" w:w="2412"/>
+          </w:tcPr>
+          <w:p>
+            <w:r>
+              <w:t>Tertiary Infotech Academy Pte Ltd</w:t>
+            </w:r>
+          </w:p>
+        </w:tc>
+      </w:tr>
+      <w:tr>
+        <w:tc>
+          <w:tcPr>
+            <w:tcW w:type="dxa" w:w="2412"/>
+          </w:tcPr>
+          <w:p>
+            <w:r>
+              <w:t>5</w:t>
+            </w:r>
+          </w:p>
+        </w:tc>
+        <w:tc>
+          <w:tcPr>
+            <w:tcW w:type="dxa" w:w="2412"/>
+          </w:tcPr>
+          <w:p>
+            <w:r>
+              <w:t>13 July 2026</w:t>
+            </w:r>
+          </w:p>
+        </w:tc>
+        <w:tc>
+          <w:tcPr>
+            <w:tcW w:type="dxa" w:w="2412"/>
+          </w:tcPr>
+          <w:p>
+            <w:r>
+              <w:t>Regenerated from the WSQ toolchain, aligned slide references and labs, and completed visual QA and distribution readiness.</w:t>
             </w:r>
           </w:p>
         </w:tc>
@@ -298,11 +375,11 @@
     </w:p>
     <w:p>
       <w:r>
-        <w:rPr>
-          <w:i/>
-          <w:color w:val="4B5563"/>
-        </w:rPr>
-        <w:t>Right-click and choose 'Update Field', or press F9, to build the table of contents.</w:t>
+        <w:fldChar w:fldCharType="begin"/>
+        <w:instrText xml:space="preserve">TOC \o "1-3" \h \z \u</w:instrText>
+        <w:fldChar w:fldCharType="separate"/>
+        <w:t>Update the table of contents in Word (F9).</w:t>
+        <w:fldChar w:fldCharType="end"/>
       </w:r>
     </w:p>
     <w:p>
@@ -954,7 +1031,7 @@
         <w:drawing>
           <wp:inline xmlns:a="http://schemas.openxmlformats.org/drawingml/2006/main" xmlns:pic="http://schemas.openxmlformats.org/drawingml/2006/picture">
             <wp:extent cx="5852160" cy="3291840"/>
-            <wp:docPr id="1" name="Picture 1"/>
+            <wp:docPr id="2" name="Picture 2"/>
             <wp:cNvGraphicFramePr>
               <a:graphicFrameLocks noChangeAspect="1"/>
             </wp:cNvGraphicFramePr>
@@ -1014,7 +1091,7 @@
         <w:drawing>
           <wp:inline xmlns:a="http://schemas.openxmlformats.org/drawingml/2006/main" xmlns:pic="http://schemas.openxmlformats.org/drawingml/2006/picture">
             <wp:extent cx="5852160" cy="3291840"/>
-            <wp:docPr id="2" name="Picture 2"/>
+            <wp:docPr id="3" name="Picture 3"/>
             <wp:cNvGraphicFramePr>
               <a:graphicFrameLocks noChangeAspect="1"/>
             </wp:cNvGraphicFramePr>
@@ -1074,7 +1151,7 @@
         <w:drawing>
           <wp:inline xmlns:a="http://schemas.openxmlformats.org/drawingml/2006/main" xmlns:pic="http://schemas.openxmlformats.org/drawingml/2006/picture">
             <wp:extent cx="5852160" cy="3291840"/>
-            <wp:docPr id="3" name="Picture 3"/>
+            <wp:docPr id="4" name="Picture 4"/>
             <wp:cNvGraphicFramePr>
               <a:graphicFrameLocks noChangeAspect="1"/>
             </wp:cNvGraphicFramePr>
@@ -1134,7 +1211,7 @@
         <w:drawing>
           <wp:inline xmlns:a="http://schemas.openxmlformats.org/drawingml/2006/main" xmlns:pic="http://schemas.openxmlformats.org/drawingml/2006/picture">
             <wp:extent cx="5852160" cy="3291840"/>
-            <wp:docPr id="4" name="Picture 4"/>
+            <wp:docPr id="5" name="Picture 5"/>
             <wp:cNvGraphicFramePr>
               <a:graphicFrameLocks noChangeAspect="1"/>
             </wp:cNvGraphicFramePr>
@@ -1236,7 +1313,7 @@
         <w:drawing>
           <wp:inline xmlns:a="http://schemas.openxmlformats.org/drawingml/2006/main" xmlns:pic="http://schemas.openxmlformats.org/drawingml/2006/picture">
             <wp:extent cx="5989320" cy="3368992"/>
-            <wp:docPr id="5" name="Picture 5"/>
+            <wp:docPr id="6" name="Picture 6"/>
             <wp:cNvGraphicFramePr>
               <a:graphicFrameLocks noChangeAspect="1"/>
             </wp:cNvGraphicFramePr>
@@ -1847,7 +1924,7 @@
         <w:drawing>
           <wp:inline xmlns:a="http://schemas.openxmlformats.org/drawingml/2006/main" xmlns:pic="http://schemas.openxmlformats.org/drawingml/2006/picture">
             <wp:extent cx="5989320" cy="3368992"/>
-            <wp:docPr id="6" name="Picture 6"/>
+            <wp:docPr id="7" name="Picture 7"/>
             <wp:cNvGraphicFramePr>
               <a:graphicFrameLocks noChangeAspect="1"/>
             </wp:cNvGraphicFramePr>
@@ -2454,7 +2531,7 @@
         <w:drawing>
           <wp:inline xmlns:a="http://schemas.openxmlformats.org/drawingml/2006/main" xmlns:pic="http://schemas.openxmlformats.org/drawingml/2006/picture">
             <wp:extent cx="5989320" cy="3368992"/>
-            <wp:docPr id="7" name="Picture 7"/>
+            <wp:docPr id="8" name="Picture 8"/>
             <wp:cNvGraphicFramePr>
               <a:graphicFrameLocks noChangeAspect="1"/>
             </wp:cNvGraphicFramePr>
@@ -3037,7 +3114,7 @@
         <w:drawing>
           <wp:inline xmlns:a="http://schemas.openxmlformats.org/drawingml/2006/main" xmlns:pic="http://schemas.openxmlformats.org/drawingml/2006/picture">
             <wp:extent cx="5989320" cy="3368992"/>
-            <wp:docPr id="8" name="Picture 8"/>
+            <wp:docPr id="9" name="Picture 9"/>
             <wp:cNvGraphicFramePr>
               <a:graphicFrameLocks noChangeAspect="1"/>
             </wp:cNvGraphicFramePr>
@@ -3612,7 +3689,7 @@
         <w:drawing>
           <wp:inline xmlns:a="http://schemas.openxmlformats.org/drawingml/2006/main" xmlns:pic="http://schemas.openxmlformats.org/drawingml/2006/picture">
             <wp:extent cx="5989320" cy="3368992"/>
-            <wp:docPr id="9" name="Picture 9"/>
+            <wp:docPr id="10" name="Picture 10"/>
             <wp:cNvGraphicFramePr>
               <a:graphicFrameLocks noChangeAspect="1"/>
             </wp:cNvGraphicFramePr>
@@ -4147,7 +4224,7 @@
         <w:drawing>
           <wp:inline xmlns:a="http://schemas.openxmlformats.org/drawingml/2006/main" xmlns:pic="http://schemas.openxmlformats.org/drawingml/2006/picture">
             <wp:extent cx="5989320" cy="3368992"/>
-            <wp:docPr id="10" name="Picture 10"/>
+            <wp:docPr id="11" name="Picture 11"/>
             <wp:cNvGraphicFramePr>
               <a:graphicFrameLocks noChangeAspect="1"/>
             </wp:cNvGraphicFramePr>
@@ -4738,7 +4815,7 @@
         <w:drawing>
           <wp:inline xmlns:a="http://schemas.openxmlformats.org/drawingml/2006/main" xmlns:pic="http://schemas.openxmlformats.org/drawingml/2006/picture">
             <wp:extent cx="5989320" cy="3368992"/>
-            <wp:docPr id="11" name="Picture 11"/>
+            <wp:docPr id="12" name="Picture 12"/>
             <wp:cNvGraphicFramePr>
               <a:graphicFrameLocks noChangeAspect="1"/>
             </wp:cNvGraphicFramePr>
@@ -5281,7 +5358,7 @@
         <w:drawing>
           <wp:inline xmlns:a="http://schemas.openxmlformats.org/drawingml/2006/main" xmlns:pic="http://schemas.openxmlformats.org/drawingml/2006/picture">
             <wp:extent cx="5989320" cy="3368992"/>
-            <wp:docPr id="12" name="Picture 12"/>
+            <wp:docPr id="13" name="Picture 13"/>
             <wp:cNvGraphicFramePr>
               <a:graphicFrameLocks noChangeAspect="1"/>
             </wp:cNvGraphicFramePr>
@@ -6315,7 +6392,29 @@
         <w:color w:val="4B5563"/>
         <w:sz w:val="16"/>
       </w:rPr>
-      <w:t>Microsoft Azure Security Engineer Associate (AZ-500) | TGS-2023039344 | Tertiary Infotech Academy Pte Ltd</w:t>
+      <w:t xml:space="preserve">Microsoft Azure Security Engineer Associate (AZ-500) | TGS-2023039344 | Tertiary Infotech Academy Pte Ltd | Page </w:t>
+    </w:r>
+    <w:r>
+      <w:fldChar w:fldCharType="begin"/>
+      <w:instrText xml:space="preserve">PAGE</w:instrText>
+      <w:fldChar w:fldCharType="separate"/>
+      <w:t>1</w:t>
+      <w:fldChar w:fldCharType="end"/>
+    </w:r>
+    <w:r>
+      <w:rPr>
+        <w:rFonts w:ascii="Arial" w:hAnsi="Arial"/>
+        <w:color w:val="4B5563"/>
+        <w:sz w:val="16"/>
+      </w:rPr>
+      <w:t xml:space="preserve"> of </w:t>
+    </w:r>
+    <w:r>
+      <w:fldChar w:fldCharType="begin"/>
+      <w:instrText xml:space="preserve">NUMPAGES</w:instrText>
+      <w:fldChar w:fldCharType="separate"/>
+      <w:t>1</w:t>
+      <w:fldChar w:fldCharType="end"/>
     </w:r>
   </w:p>
   <w:p>

</xml_diff>